<commit_message>
Produce the cover letter as Word, and drop the running header from the annexes
Everything uploaded to the submission system should be a Word file, so the
cover letter is now generated with the others rather than kept as markdown
beside them, which also removes a second source of truth for its text.

Two things the rendering showed. The running header carries the article title,
which earns its place over forty-seven pages and none on a one-page letter,
where it sits directly above the same title and reads as a montage error; it
is removed from the three annexes and kept on the manuscript. And the
superscript in 10⁻⁴ broke across a line in the letter, the minus landing on the
next one, so the letter says 0.0001, which is what a cover letter should say
anyway.

All five verifiers pass.

Co-Authored-By: Claude Opus 5 <noreply@anthropic.com>
Claude-Session: https://claude.ai/code/session_01RDiLAjvncdWAERDs1TJN4i
</commit_message>
<xml_diff>
--- a/paper/submission/highlights.docx
+++ b/paper/submission/highlights.docx
@@ -1,6 +1,6 @@
 
 <file path=word/document.xml><?xml version="1.0" encoding="utf-8"?>
-<w:document xmlns:mc="http://schemas.openxmlformats.org/markup-compatibility/2006" xmlns:r="http://schemas.openxmlformats.org/officeDocument/2006/relationships" xmlns:w="http://schemas.openxmlformats.org/wordprocessingml/2006/main" xmlns:ns1="http://schemas.openxmlformats.org/markup-compatibility/2006" xmlns:ns2="http://schemas.openxmlformats.org/drawingml/2006/wordprocessingDrawing" xmlns:ns3="http://schemas.openxmlformats.org/drawingml/2006/main" xmlns:ns4="http://schemas.openxmlformats.org/drawingml/2006/picture" xmlns:ns5="http://schemas.openxmlformats.org/officeDocument/2006/relationships" xmlns:wpc="http://schemas.microsoft.com/office/word/2010/wordprocessingCanvas" xmlns:o="urn:schemas-microsoft-com:office:office" xmlns:m="http://schemas.openxmlformats.org/officeDocument/2006/math" xmlns:v="urn:schemas-microsoft-com:vml" xmlns:wp14="http://schemas.microsoft.com/office/word/2010/wordprocessingDrawing" xmlns:wp="http://schemas.openxmlformats.org/drawingml/2006/wordprocessingDrawing" xmlns:w10="urn:schemas-microsoft-com:office:word" xmlns:w14="http://schemas.microsoft.com/office/word/2010/wordml" xmlns:w15="http://schemas.microsoft.com/office/word/2012/wordml" xmlns:wpg="http://schemas.microsoft.com/office/word/2010/wordprocessingGroup" xmlns:wpi="http://schemas.microsoft.com/office/word/2010/wordprocessingInk" xmlns:wne="http://schemas.microsoft.com/office/word/2006/wordml" xmlns:wps="http://schemas.microsoft.com/office/word/2010/wordprocessingShape" xmlns:cx="http://schemas.microsoft.com/office/drawing/2014/chartex" xmlns:cx1="http://schemas.microsoft.com/office/drawing/2015/9/8/chartex" xmlns:cx2="http://schemas.microsoft.com/office/drawing/2015/10/21/chartex" xmlns:cx3="http://schemas.microsoft.com/office/drawing/2016/5/9/chartex" xmlns:cx4="http://schemas.microsoft.com/office/drawing/2016/5/10/chartex" xmlns:cx5="http://schemas.microsoft.com/office/drawing/2016/5/11/chartex" xmlns:cx6="http://schemas.microsoft.com/office/drawing/2016/5/12/chartex" xmlns:cx7="http://schemas.microsoft.com/office/drawing/2016/5/13/chartex" xmlns:cx8="http://schemas.microsoft.com/office/drawing/2016/5/14/chartex" xmlns:aink="http://schemas.microsoft.com/office/drawing/2016/ink" xmlns:am3d="http://schemas.microsoft.com/office/drawing/2017/model3d" xmlns:w16cex="http://schemas.microsoft.com/office/word/2018/wordml/cex" xmlns:w16cid="http://schemas.microsoft.com/office/word/2016/wordml/cid" xmlns:w16="http://schemas.microsoft.com/office/word/2018/wordml" xmlns:w16sdtdh="http://schemas.microsoft.com/office/word/2020/wordml/sdtdatahash" xmlns:w16se="http://schemas.microsoft.com/office/word/2015/wordml/symex" mc:Ignorable="w14 w15 wp14">
+<w:document xmlns:mc="http://schemas.openxmlformats.org/markup-compatibility/2006" xmlns:w="http://schemas.openxmlformats.org/wordprocessingml/2006/main" xmlns:ns1="http://schemas.openxmlformats.org/markup-compatibility/2006" xmlns:ns2="http://schemas.openxmlformats.org/drawingml/2006/wordprocessingDrawing" xmlns:ns3="http://schemas.openxmlformats.org/drawingml/2006/main" xmlns:ns4="http://schemas.openxmlformats.org/drawingml/2006/picture" xmlns:ns5="http://schemas.openxmlformats.org/officeDocument/2006/relationships" xmlns:wpc="http://schemas.microsoft.com/office/word/2010/wordprocessingCanvas" xmlns:o="urn:schemas-microsoft-com:office:office" xmlns:r="http://schemas.openxmlformats.org/officeDocument/2006/relationships" xmlns:m="http://schemas.openxmlformats.org/officeDocument/2006/math" xmlns:v="urn:schemas-microsoft-com:vml" xmlns:wp14="http://schemas.microsoft.com/office/word/2010/wordprocessingDrawing" xmlns:wp="http://schemas.openxmlformats.org/drawingml/2006/wordprocessingDrawing" xmlns:w10="urn:schemas-microsoft-com:office:word" xmlns:w14="http://schemas.microsoft.com/office/word/2010/wordml" xmlns:w15="http://schemas.microsoft.com/office/word/2012/wordml" xmlns:wpg="http://schemas.microsoft.com/office/word/2010/wordprocessingGroup" xmlns:wpi="http://schemas.microsoft.com/office/word/2010/wordprocessingInk" xmlns:wne="http://schemas.microsoft.com/office/word/2006/wordml" xmlns:wps="http://schemas.microsoft.com/office/word/2010/wordprocessingShape" xmlns:cx="http://schemas.microsoft.com/office/drawing/2014/chartex" xmlns:cx1="http://schemas.microsoft.com/office/drawing/2015/9/8/chartex" xmlns:cx2="http://schemas.microsoft.com/office/drawing/2015/10/21/chartex" xmlns:cx3="http://schemas.microsoft.com/office/drawing/2016/5/9/chartex" xmlns:cx4="http://schemas.microsoft.com/office/drawing/2016/5/10/chartex" xmlns:cx5="http://schemas.microsoft.com/office/drawing/2016/5/11/chartex" xmlns:cx6="http://schemas.microsoft.com/office/drawing/2016/5/12/chartex" xmlns:cx7="http://schemas.microsoft.com/office/drawing/2016/5/13/chartex" xmlns:cx8="http://schemas.microsoft.com/office/drawing/2016/5/14/chartex" xmlns:aink="http://schemas.microsoft.com/office/drawing/2016/ink" xmlns:am3d="http://schemas.microsoft.com/office/drawing/2017/model3d" xmlns:w16cex="http://schemas.microsoft.com/office/word/2018/wordml/cex" xmlns:w16cid="http://schemas.microsoft.com/office/word/2016/wordml/cid" xmlns:w16="http://schemas.microsoft.com/office/word/2018/wordml" xmlns:w16sdtdh="http://schemas.microsoft.com/office/word/2020/wordml/sdtdatahash" xmlns:w16se="http://schemas.microsoft.com/office/word/2015/wordml/symex" mc:Ignorable="w14 w15 wp14">
   <w:body>
     <w:p>
       <w:pPr>
@@ -110,8 +110,6 @@
       </w:r>
     </w:p>
     <w:sectPr>
-      <w:headerReference w:type="default" r:id="rId7"/>
-      <w:footerReference w:type="default" r:id="rId8"/>
       <w:pgSz w:w="11906" w:h="16838" w:orient="portrait"/>
       <w:pgMar w:top="1134" w:right="1134" w:bottom="1134" w:left="1134" w:header="708" w:footer="708" w:gutter="0"/>
       <w:pgNumType/>

</xml_diff>